<commit_message>
Fase 2: informes 2.4 y 2.6, diario 2.1 de Luis, MER completo, diccionario de datos, diagramas desde el código, pruebas y metodología
</commit_message>
<xml_diff>
--- a/fase 2/Evidencias Proyecto/Documentos de gestion/Informe_Estado_Avance_KalliCode.docx
+++ b/fase 2/Evidencias Proyecto/Documentos de gestion/Informe_Estado_Avance_KalliCode.docx
@@ -520,12 +520,6 @@
                 </w:pict>
               </mc:Fallback>
             </mc:AlternateContent>
-          </w:r>
-          <w:r>
-            <w:rPr>
-              <w:color w:val="4F81BD" w:themeColor="accent1"/>
-              <w:lang w:val="es-CL"/>
-            </w:rPr>
             <w:drawing>
               <wp:inline distT="0" distB="0" distL="0" distR="0" wp14:anchorId="10D40041" wp14:editId="301A76A3">
                 <wp:extent cx="758952" cy="478932"/>
@@ -634,11 +628,7 @@
           </w:pPr>
           <w:r>
             <w:fldChar w:fldCharType="begin"/>
-          </w:r>
-          <w:r>
             <w:instrText xml:space="preserve"> TOC \o "1-3" \h \z \u </w:instrText>
-          </w:r>
-          <w:r>
             <w:fldChar w:fldCharType="separate"/>
           </w:r>
           <w:hyperlink w:anchor="_Toc240108194" w:history="1">
@@ -655,46 +645,10 @@
                 <w:webHidden/>
               </w:rPr>
               <w:tab/>
-            </w:r>
-            <w:r>
-              <w:rPr>
-                <w:noProof/>
-                <w:webHidden/>
-              </w:rPr>
               <w:fldChar w:fldCharType="begin"/>
-            </w:r>
-            <w:r>
-              <w:rPr>
-                <w:noProof/>
-                <w:webHidden/>
-              </w:rPr>
               <w:instrText xml:space="preserve"> PAGEREF _Toc240108194 \h </w:instrText>
-            </w:r>
-            <w:r>
-              <w:rPr>
-                <w:noProof/>
-                <w:webHidden/>
-              </w:rPr>
-            </w:r>
-            <w:r>
-              <w:rPr>
-                <w:noProof/>
-                <w:webHidden/>
-              </w:rPr>
               <w:fldChar w:fldCharType="separate"/>
-            </w:r>
-            <w:r>
-              <w:rPr>
-                <w:noProof/>
-                <w:webHidden/>
-              </w:rPr>
               <w:t>1</w:t>
-            </w:r>
-            <w:r>
-              <w:rPr>
-                <w:noProof/>
-                <w:webHidden/>
-              </w:rPr>
               <w:fldChar w:fldCharType="end"/>
             </w:r>
           </w:hyperlink>
@@ -723,46 +677,10 @@
                 <w:webHidden/>
               </w:rPr>
               <w:tab/>
-            </w:r>
-            <w:r>
-              <w:rPr>
-                <w:noProof/>
-                <w:webHidden/>
-              </w:rPr>
               <w:fldChar w:fldCharType="begin"/>
-            </w:r>
-            <w:r>
-              <w:rPr>
-                <w:noProof/>
-                <w:webHidden/>
-              </w:rPr>
               <w:instrText xml:space="preserve"> PAGEREF _Toc240108195 \h </w:instrText>
-            </w:r>
-            <w:r>
-              <w:rPr>
-                <w:noProof/>
-                <w:webHidden/>
-              </w:rPr>
-            </w:r>
-            <w:r>
-              <w:rPr>
-                <w:noProof/>
-                <w:webHidden/>
-              </w:rPr>
               <w:fldChar w:fldCharType="separate"/>
-            </w:r>
-            <w:r>
-              <w:rPr>
-                <w:noProof/>
-                <w:webHidden/>
-              </w:rPr>
               <w:t>2</w:t>
-            </w:r>
-            <w:r>
-              <w:rPr>
-                <w:noProof/>
-                <w:webHidden/>
-              </w:rPr>
               <w:fldChar w:fldCharType="end"/>
             </w:r>
           </w:hyperlink>
@@ -791,46 +709,10 @@
                 <w:webHidden/>
               </w:rPr>
               <w:tab/>
-            </w:r>
-            <w:r>
-              <w:rPr>
-                <w:noProof/>
-                <w:webHidden/>
-              </w:rPr>
               <w:fldChar w:fldCharType="begin"/>
-            </w:r>
-            <w:r>
-              <w:rPr>
-                <w:noProof/>
-                <w:webHidden/>
-              </w:rPr>
               <w:instrText xml:space="preserve"> PAGEREF _Toc240108196 \h </w:instrText>
-            </w:r>
-            <w:r>
-              <w:rPr>
-                <w:noProof/>
-                <w:webHidden/>
-              </w:rPr>
-            </w:r>
-            <w:r>
-              <w:rPr>
-                <w:noProof/>
-                <w:webHidden/>
-              </w:rPr>
               <w:fldChar w:fldCharType="separate"/>
-            </w:r>
-            <w:r>
-              <w:rPr>
-                <w:noProof/>
-                <w:webHidden/>
-              </w:rPr>
               <w:t>2</w:t>
-            </w:r>
-            <w:r>
-              <w:rPr>
-                <w:noProof/>
-                <w:webHidden/>
-              </w:rPr>
               <w:fldChar w:fldCharType="end"/>
             </w:r>
           </w:hyperlink>
@@ -859,46 +741,10 @@
                 <w:webHidden/>
               </w:rPr>
               <w:tab/>
-            </w:r>
-            <w:r>
-              <w:rPr>
-                <w:noProof/>
-                <w:webHidden/>
-              </w:rPr>
               <w:fldChar w:fldCharType="begin"/>
-            </w:r>
-            <w:r>
-              <w:rPr>
-                <w:noProof/>
-                <w:webHidden/>
-              </w:rPr>
               <w:instrText xml:space="preserve"> PAGEREF _Toc240108197 \h </w:instrText>
-            </w:r>
-            <w:r>
-              <w:rPr>
-                <w:noProof/>
-                <w:webHidden/>
-              </w:rPr>
-            </w:r>
-            <w:r>
-              <w:rPr>
-                <w:noProof/>
-                <w:webHidden/>
-              </w:rPr>
               <w:fldChar w:fldCharType="separate"/>
-            </w:r>
-            <w:r>
-              <w:rPr>
-                <w:noProof/>
-                <w:webHidden/>
-              </w:rPr>
               <w:t>3</w:t>
-            </w:r>
-            <w:r>
-              <w:rPr>
-                <w:noProof/>
-                <w:webHidden/>
-              </w:rPr>
               <w:fldChar w:fldCharType="end"/>
             </w:r>
           </w:hyperlink>
@@ -927,46 +773,10 @@
                 <w:webHidden/>
               </w:rPr>
               <w:tab/>
-            </w:r>
-            <w:r>
-              <w:rPr>
-                <w:noProof/>
-                <w:webHidden/>
-              </w:rPr>
               <w:fldChar w:fldCharType="begin"/>
-            </w:r>
-            <w:r>
-              <w:rPr>
-                <w:noProof/>
-                <w:webHidden/>
-              </w:rPr>
               <w:instrText xml:space="preserve"> PAGEREF _Toc240108198 \h </w:instrText>
-            </w:r>
-            <w:r>
-              <w:rPr>
-                <w:noProof/>
-                <w:webHidden/>
-              </w:rPr>
-            </w:r>
-            <w:r>
-              <w:rPr>
-                <w:noProof/>
-                <w:webHidden/>
-              </w:rPr>
               <w:fldChar w:fldCharType="separate"/>
-            </w:r>
-            <w:r>
-              <w:rPr>
-                <w:noProof/>
-                <w:webHidden/>
-              </w:rPr>
               <w:t>3</w:t>
-            </w:r>
-            <w:r>
-              <w:rPr>
-                <w:noProof/>
-                <w:webHidden/>
-              </w:rPr>
               <w:fldChar w:fldCharType="end"/>
             </w:r>
           </w:hyperlink>
@@ -995,46 +805,10 @@
                 <w:webHidden/>
               </w:rPr>
               <w:tab/>
-            </w:r>
-            <w:r>
-              <w:rPr>
-                <w:noProof/>
-                <w:webHidden/>
-              </w:rPr>
               <w:fldChar w:fldCharType="begin"/>
-            </w:r>
-            <w:r>
-              <w:rPr>
-                <w:noProof/>
-                <w:webHidden/>
-              </w:rPr>
               <w:instrText xml:space="preserve"> PAGEREF _Toc240108199 \h </w:instrText>
-            </w:r>
-            <w:r>
-              <w:rPr>
-                <w:noProof/>
-                <w:webHidden/>
-              </w:rPr>
-            </w:r>
-            <w:r>
-              <w:rPr>
-                <w:noProof/>
-                <w:webHidden/>
-              </w:rPr>
               <w:fldChar w:fldCharType="separate"/>
-            </w:r>
-            <w:r>
-              <w:rPr>
-                <w:noProof/>
-                <w:webHidden/>
-              </w:rPr>
               <w:t>3</w:t>
-            </w:r>
-            <w:r>
-              <w:rPr>
-                <w:noProof/>
-                <w:webHidden/>
-              </w:rPr>
               <w:fldChar w:fldCharType="end"/>
             </w:r>
           </w:hyperlink>
@@ -1063,46 +837,10 @@
                 <w:webHidden/>
               </w:rPr>
               <w:tab/>
-            </w:r>
-            <w:r>
-              <w:rPr>
-                <w:noProof/>
-                <w:webHidden/>
-              </w:rPr>
               <w:fldChar w:fldCharType="begin"/>
-            </w:r>
-            <w:r>
-              <w:rPr>
-                <w:noProof/>
-                <w:webHidden/>
-              </w:rPr>
               <w:instrText xml:space="preserve"> PAGEREF _Toc240108200 \h </w:instrText>
-            </w:r>
-            <w:r>
-              <w:rPr>
-                <w:noProof/>
-                <w:webHidden/>
-              </w:rPr>
-            </w:r>
-            <w:r>
-              <w:rPr>
-                <w:noProof/>
-                <w:webHidden/>
-              </w:rPr>
               <w:fldChar w:fldCharType="separate"/>
-            </w:r>
-            <w:r>
-              <w:rPr>
-                <w:noProof/>
-                <w:webHidden/>
-              </w:rPr>
               <w:t>3</w:t>
-            </w:r>
-            <w:r>
-              <w:rPr>
-                <w:noProof/>
-                <w:webHidden/>
-              </w:rPr>
               <w:fldChar w:fldCharType="end"/>
             </w:r>
           </w:hyperlink>
@@ -1131,46 +869,10 @@
                 <w:webHidden/>
               </w:rPr>
               <w:tab/>
-            </w:r>
-            <w:r>
-              <w:rPr>
-                <w:noProof/>
-                <w:webHidden/>
-              </w:rPr>
               <w:fldChar w:fldCharType="begin"/>
-            </w:r>
-            <w:r>
-              <w:rPr>
-                <w:noProof/>
-                <w:webHidden/>
-              </w:rPr>
               <w:instrText xml:space="preserve"> PAGEREF _Toc240108201 \h </w:instrText>
-            </w:r>
-            <w:r>
-              <w:rPr>
-                <w:noProof/>
-                <w:webHidden/>
-              </w:rPr>
-            </w:r>
-            <w:r>
-              <w:rPr>
-                <w:noProof/>
-                <w:webHidden/>
-              </w:rPr>
               <w:fldChar w:fldCharType="separate"/>
-            </w:r>
-            <w:r>
-              <w:rPr>
-                <w:noProof/>
-                <w:webHidden/>
-              </w:rPr>
               <w:t>3</w:t>
-            </w:r>
-            <w:r>
-              <w:rPr>
-                <w:noProof/>
-                <w:webHidden/>
-              </w:rPr>
               <w:fldChar w:fldCharType="end"/>
             </w:r>
           </w:hyperlink>
@@ -1199,46 +901,10 @@
                 <w:webHidden/>
               </w:rPr>
               <w:tab/>
-            </w:r>
-            <w:r>
-              <w:rPr>
-                <w:noProof/>
-                <w:webHidden/>
-              </w:rPr>
               <w:fldChar w:fldCharType="begin"/>
-            </w:r>
-            <w:r>
-              <w:rPr>
-                <w:noProof/>
-                <w:webHidden/>
-              </w:rPr>
               <w:instrText xml:space="preserve"> PAGEREF _Toc240108202 \h </w:instrText>
-            </w:r>
-            <w:r>
-              <w:rPr>
-                <w:noProof/>
-                <w:webHidden/>
-              </w:rPr>
-            </w:r>
-            <w:r>
-              <w:rPr>
-                <w:noProof/>
-                <w:webHidden/>
-              </w:rPr>
               <w:fldChar w:fldCharType="separate"/>
-            </w:r>
-            <w:r>
-              <w:rPr>
-                <w:noProof/>
-                <w:webHidden/>
-              </w:rPr>
               <w:t>4</w:t>
-            </w:r>
-            <w:r>
-              <w:rPr>
-                <w:noProof/>
-                <w:webHidden/>
-              </w:rPr>
               <w:fldChar w:fldCharType="end"/>
             </w:r>
           </w:hyperlink>
@@ -1267,46 +933,10 @@
                 <w:webHidden/>
               </w:rPr>
               <w:tab/>
-            </w:r>
-            <w:r>
-              <w:rPr>
-                <w:noProof/>
-                <w:webHidden/>
-              </w:rPr>
               <w:fldChar w:fldCharType="begin"/>
-            </w:r>
-            <w:r>
-              <w:rPr>
-                <w:noProof/>
-                <w:webHidden/>
-              </w:rPr>
               <w:instrText xml:space="preserve"> PAGEREF _Toc240108203 \h </w:instrText>
-            </w:r>
-            <w:r>
-              <w:rPr>
-                <w:noProof/>
-                <w:webHidden/>
-              </w:rPr>
-            </w:r>
-            <w:r>
-              <w:rPr>
-                <w:noProof/>
-                <w:webHidden/>
-              </w:rPr>
               <w:fldChar w:fldCharType="separate"/>
-            </w:r>
-            <w:r>
-              <w:rPr>
-                <w:noProof/>
-                <w:webHidden/>
-              </w:rPr>
               <w:t>4</w:t>
-            </w:r>
-            <w:r>
-              <w:rPr>
-                <w:noProof/>
-                <w:webHidden/>
-              </w:rPr>
               <w:fldChar w:fldCharType="end"/>
             </w:r>
           </w:hyperlink>
@@ -1335,46 +965,10 @@
                 <w:webHidden/>
               </w:rPr>
               <w:tab/>
-            </w:r>
-            <w:r>
-              <w:rPr>
-                <w:noProof/>
-                <w:webHidden/>
-              </w:rPr>
               <w:fldChar w:fldCharType="begin"/>
-            </w:r>
-            <w:r>
-              <w:rPr>
-                <w:noProof/>
-                <w:webHidden/>
-              </w:rPr>
               <w:instrText xml:space="preserve"> PAGEREF _Toc240108204 \h </w:instrText>
-            </w:r>
-            <w:r>
-              <w:rPr>
-                <w:noProof/>
-                <w:webHidden/>
-              </w:rPr>
-            </w:r>
-            <w:r>
-              <w:rPr>
-                <w:noProof/>
-                <w:webHidden/>
-              </w:rPr>
               <w:fldChar w:fldCharType="separate"/>
-            </w:r>
-            <w:r>
-              <w:rPr>
-                <w:noProof/>
-                <w:webHidden/>
-              </w:rPr>
               <w:t>4</w:t>
-            </w:r>
-            <w:r>
-              <w:rPr>
-                <w:noProof/>
-                <w:webHidden/>
-              </w:rPr>
               <w:fldChar w:fldCharType="end"/>
             </w:r>
           </w:hyperlink>
@@ -1403,46 +997,10 @@
                 <w:webHidden/>
               </w:rPr>
               <w:tab/>
-            </w:r>
-            <w:r>
-              <w:rPr>
-                <w:noProof/>
-                <w:webHidden/>
-              </w:rPr>
               <w:fldChar w:fldCharType="begin"/>
-            </w:r>
-            <w:r>
-              <w:rPr>
-                <w:noProof/>
-                <w:webHidden/>
-              </w:rPr>
               <w:instrText xml:space="preserve"> PAGEREF _Toc240108205 \h </w:instrText>
-            </w:r>
-            <w:r>
-              <w:rPr>
-                <w:noProof/>
-                <w:webHidden/>
-              </w:rPr>
-            </w:r>
-            <w:r>
-              <w:rPr>
-                <w:noProof/>
-                <w:webHidden/>
-              </w:rPr>
               <w:fldChar w:fldCharType="separate"/>
-            </w:r>
-            <w:r>
-              <w:rPr>
-                <w:noProof/>
-                <w:webHidden/>
-              </w:rPr>
               <w:t>5</w:t>
-            </w:r>
-            <w:r>
-              <w:rPr>
-                <w:noProof/>
-                <w:webHidden/>
-              </w:rPr>
               <w:fldChar w:fldCharType="end"/>
             </w:r>
           </w:hyperlink>
@@ -1471,46 +1029,10 @@
                 <w:webHidden/>
               </w:rPr>
               <w:tab/>
-            </w:r>
-            <w:r>
-              <w:rPr>
-                <w:noProof/>
-                <w:webHidden/>
-              </w:rPr>
               <w:fldChar w:fldCharType="begin"/>
-            </w:r>
-            <w:r>
-              <w:rPr>
-                <w:noProof/>
-                <w:webHidden/>
-              </w:rPr>
               <w:instrText xml:space="preserve"> PAGEREF _Toc240108206 \h </w:instrText>
-            </w:r>
-            <w:r>
-              <w:rPr>
-                <w:noProof/>
-                <w:webHidden/>
-              </w:rPr>
-            </w:r>
-            <w:r>
-              <w:rPr>
-                <w:noProof/>
-                <w:webHidden/>
-              </w:rPr>
               <w:fldChar w:fldCharType="separate"/>
-            </w:r>
-            <w:r>
-              <w:rPr>
-                <w:noProof/>
-                <w:webHidden/>
-              </w:rPr>
               <w:t>5</w:t>
-            </w:r>
-            <w:r>
-              <w:rPr>
-                <w:noProof/>
-                <w:webHidden/>
-              </w:rPr>
               <w:fldChar w:fldCharType="end"/>
             </w:r>
           </w:hyperlink>
@@ -1539,46 +1061,10 @@
                 <w:webHidden/>
               </w:rPr>
               <w:tab/>
-            </w:r>
-            <w:r>
-              <w:rPr>
-                <w:noProof/>
-                <w:webHidden/>
-              </w:rPr>
               <w:fldChar w:fldCharType="begin"/>
-            </w:r>
-            <w:r>
-              <w:rPr>
-                <w:noProof/>
-                <w:webHidden/>
-              </w:rPr>
               <w:instrText xml:space="preserve"> PAGEREF _Toc240108207 \h </w:instrText>
-            </w:r>
-            <w:r>
-              <w:rPr>
-                <w:noProof/>
-                <w:webHidden/>
-              </w:rPr>
-            </w:r>
-            <w:r>
-              <w:rPr>
-                <w:noProof/>
-                <w:webHidden/>
-              </w:rPr>
               <w:fldChar w:fldCharType="separate"/>
-            </w:r>
-            <w:r>
-              <w:rPr>
-                <w:noProof/>
-                <w:webHidden/>
-              </w:rPr>
               <w:t>5</w:t>
-            </w:r>
-            <w:r>
-              <w:rPr>
-                <w:noProof/>
-                <w:webHidden/>
-              </w:rPr>
               <w:fldChar w:fldCharType="end"/>
             </w:r>
           </w:hyperlink>
@@ -1607,46 +1093,10 @@
                 <w:webHidden/>
               </w:rPr>
               <w:tab/>
-            </w:r>
-            <w:r>
-              <w:rPr>
-                <w:noProof/>
-                <w:webHidden/>
-              </w:rPr>
               <w:fldChar w:fldCharType="begin"/>
-            </w:r>
-            <w:r>
-              <w:rPr>
-                <w:noProof/>
-                <w:webHidden/>
-              </w:rPr>
               <w:instrText xml:space="preserve"> PAGEREF _Toc240108208 \h </w:instrText>
-            </w:r>
-            <w:r>
-              <w:rPr>
-                <w:noProof/>
-                <w:webHidden/>
-              </w:rPr>
-            </w:r>
-            <w:r>
-              <w:rPr>
-                <w:noProof/>
-                <w:webHidden/>
-              </w:rPr>
               <w:fldChar w:fldCharType="separate"/>
-            </w:r>
-            <w:r>
-              <w:rPr>
-                <w:noProof/>
-                <w:webHidden/>
-              </w:rPr>
               <w:t>5</w:t>
-            </w:r>
-            <w:r>
-              <w:rPr>
-                <w:noProof/>
-                <w:webHidden/>
-              </w:rPr>
               <w:fldChar w:fldCharType="end"/>
             </w:r>
           </w:hyperlink>
@@ -1675,46 +1125,10 @@
                 <w:webHidden/>
               </w:rPr>
               <w:tab/>
-            </w:r>
-            <w:r>
-              <w:rPr>
-                <w:noProof/>
-                <w:webHidden/>
-              </w:rPr>
               <w:fldChar w:fldCharType="begin"/>
-            </w:r>
-            <w:r>
-              <w:rPr>
-                <w:noProof/>
-                <w:webHidden/>
-              </w:rPr>
               <w:instrText xml:space="preserve"> PAGEREF _Toc240108209 \h </w:instrText>
-            </w:r>
-            <w:r>
-              <w:rPr>
-                <w:noProof/>
-                <w:webHidden/>
-              </w:rPr>
-            </w:r>
-            <w:r>
-              <w:rPr>
-                <w:noProof/>
-                <w:webHidden/>
-              </w:rPr>
               <w:fldChar w:fldCharType="separate"/>
-            </w:r>
-            <w:r>
-              <w:rPr>
-                <w:noProof/>
-                <w:webHidden/>
-              </w:rPr>
               <w:t>5</w:t>
-            </w:r>
-            <w:r>
-              <w:rPr>
-                <w:noProof/>
-                <w:webHidden/>
-              </w:rPr>
               <w:fldChar w:fldCharType="end"/>
             </w:r>
           </w:hyperlink>
@@ -1755,10 +1169,7 @@
       <w:bookmarkStart w:id="0" w:name="_Toc240108194"/>
       <w:r>
         <w:lastRenderedPageBreak/>
-        <w:t>1</w:t>
-      </w:r>
-      <w:r>
-        <w:t>. RESUMEN EJECUTIVO DE PROGRESO</w:t>
+        <w:t>1. RESUMEN EJECUTIVO DE PROGRESO</w:t>
       </w:r>
       <w:bookmarkEnd w:id="0"/>
     </w:p>
@@ -1815,21 +1226,10 @@
         <w:rPr>
           <w:b/>
         </w:rPr>
-        <w:t xml:space="preserve">Fábrica </w:t>
-      </w:r>
-      <w:proofErr w:type="spellStart"/>
-      <w:r>
-        <w:rPr>
-          <w:b/>
-        </w:rPr>
-        <w:t>Agéntica</w:t>
-      </w:r>
-      <w:r>
-        <w:t>.La</w:t>
-      </w:r>
-      <w:proofErr w:type="spellEnd"/>
-      <w:r>
-        <w:t xml:space="preserve"> arquitectura actual garantiza la </w:t>
+        <w:t xml:space="preserve">Fábrica Agéntica</w:t>
+      </w:r>
+      <w:r>
+        <w:t xml:space="preserve">.La arquitectura actual garantiza la </w:t>
       </w:r>
       <w:r>
         <w:rPr>
@@ -1874,20 +1274,7 @@
         <w:t>WORM (Write Once Read Many)</w:t>
       </w:r>
       <w:r>
-        <w:t xml:space="preserve">, asegurando que toda evidencia técnica y aprobación humana quede, en términos de auditoría, "sellada en </w:t>
-      </w:r>
-      <w:proofErr w:type="spellStart"/>
-      <w:r>
-        <w:t>piedra</w:t>
-      </w:r>
-      <w:proofErr w:type="gramStart"/>
-      <w:r>
-        <w:t>".A</w:t>
-      </w:r>
-      <w:proofErr w:type="spellEnd"/>
-      <w:proofErr w:type="gramEnd"/>
-      <w:r>
-        <w:t xml:space="preserve"> continuación, se resume el stack tecnológico operativo y los protocolos de seguridad validados:</w:t>
+        <w:t xml:space="preserve">, asegurando que toda evidencia técnica y aprobación humana quede, en términos de auditoría, "sellada en piedra".A continuación, se resume el stack tecnológico operativo y los protocolos de seguridad validados:</w:t>
       </w:r>
     </w:p>
     <w:p/>
@@ -1969,14 +1356,12 @@
             <w:r>
               <w:t xml:space="preserve">Estándar de tipado estricto con </w:t>
             </w:r>
-            <w:proofErr w:type="spellStart"/>
             <w:r>
               <w:rPr>
                 <w:b/>
               </w:rPr>
               <w:t>Mypy</w:t>
             </w:r>
-            <w:proofErr w:type="spellEnd"/>
           </w:p>
         </w:tc>
       </w:tr>
@@ -2166,15 +1551,7 @@
               <w:t>Azurite</w:t>
             </w:r>
             <w:r>
-              <w:t xml:space="preserve"> (WORM </w:t>
-            </w:r>
-            <w:proofErr w:type="spellStart"/>
-            <w:r>
-              <w:t>policy</w:t>
-            </w:r>
-            <w:proofErr w:type="spellEnd"/>
-            <w:r>
-              <w:t>)</w:t>
+              <w:t xml:space="preserve"> (WORM policy)</w:t>
             </w:r>
           </w:p>
         </w:tc>
@@ -2187,13 +1564,7 @@
       <w:bookmarkStart w:id="1" w:name="_Toc240108195"/>
       <w:r>
         <w:lastRenderedPageBreak/>
-        <w:t>2</w:t>
-      </w:r>
-      <w:r>
-        <w:t>. ESTADO DE AVANCE POR HITOS CRÍTICOS (</w:t>
-      </w:r>
-      <w:r>
-        <w:t>M1 - M6)</w:t>
+        <w:t>2. ESTADO DE AVANCE POR HITOS CRÍTICOS (M1 - M6)</w:t>
       </w:r>
       <w:bookmarkEnd w:id="1"/>
     </w:p>
@@ -2255,11 +1626,9 @@
             <w:tcW w:w="2160" w:type="dxa"/>
           </w:tcPr>
           <w:p>
-            <w:proofErr w:type="spellStart"/>
             <w:r>
               <w:t>Sprints</w:t>
             </w:r>
-            <w:proofErr w:type="spellEnd"/>
           </w:p>
         </w:tc>
       </w:tr>
@@ -2280,13 +1649,7 @@
           </w:tcPr>
           <w:p>
             <w:r>
-              <w:t xml:space="preserve">Infraestructura </w:t>
-            </w:r>
-            <w:r>
-              <w:t>RLS,</w:t>
-            </w:r>
-            <w:r>
-              <w:t xml:space="preserve"> CI/CD y entorno local reproducible.</w:t>
+              <w:t xml:space="preserve">Infraestructura RLS, CI/CD y entorno local reproducible.</w:t>
             </w:r>
           </w:p>
         </w:tc>
@@ -2328,40 +1691,7 @@
           </w:tcPr>
           <w:p>
             <w:r>
-              <w:t xml:space="preserve">Esquemas cm </w:t>
-            </w:r>
-            <w:r>
-              <w:t>(</w:t>
-            </w:r>
-            <w:proofErr w:type="gramStart"/>
-            <w:r>
-              <w:t>CodeMapping</w:t>
-            </w:r>
-            <w:r>
-              <w:t xml:space="preserve"> )</w:t>
-            </w:r>
-            <w:proofErr w:type="gramEnd"/>
-            <w:r>
-              <w:t xml:space="preserve"> y </w:t>
-            </w:r>
-            <w:proofErr w:type="spellStart"/>
-            <w:r>
-              <w:t>vec</w:t>
-            </w:r>
-            <w:proofErr w:type="spellEnd"/>
-            <w:r>
-              <w:t xml:space="preserve">. </w:t>
-            </w:r>
-            <w:proofErr w:type="spellStart"/>
-            <w:r>
-              <w:t>Deduplicación</w:t>
-            </w:r>
-            <w:proofErr w:type="spellEnd"/>
-            <w:r>
-              <w:t xml:space="preserve"> BGE-M</w:t>
-            </w:r>
-            <w:r>
-              <w:t>3.</w:t>
+              <w:t xml:space="preserve">Esquemas cm (CodeMapping ) y vec. Deduplicación BGE-M3.</w:t>
             </w:r>
           </w:p>
         </w:tc>
@@ -2445,15 +1775,7 @@
           </w:tcPr>
           <w:p>
             <w:r>
-              <w:t xml:space="preserve">Orquestador de LLM (3 </w:t>
-            </w:r>
-            <w:proofErr w:type="spellStart"/>
-            <w:r>
-              <w:t>tiers</w:t>
-            </w:r>
-            <w:proofErr w:type="spellEnd"/>
-            <w:r>
-              <w:t>) e integración de servicios.</w:t>
+              <w:t xml:space="preserve">Orquestador de LLM (3 tiers) e integración de servicios.</w:t>
             </w:r>
           </w:p>
         </w:tc>
@@ -2495,21 +1817,7 @@
           </w:tcPr>
           <w:p>
             <w:r>
-              <w:t xml:space="preserve">Conexión real con </w:t>
-            </w:r>
-            <w:r>
-              <w:t>GitHub,</w:t>
-            </w:r>
-            <w:r>
-              <w:t xml:space="preserve"> Jira y </w:t>
-            </w:r>
-            <w:proofErr w:type="spellStart"/>
-            <w:r>
-              <w:t>webhooks</w:t>
-            </w:r>
-            <w:proofErr w:type="spellEnd"/>
-            <w:r>
-              <w:t xml:space="preserve"> operativos.</w:t>
+              <w:t xml:space="preserve">Conexión real con GitHub, Jira y webhooks operativos.</w:t>
             </w:r>
           </w:p>
         </w:tc>
@@ -2541,15 +1849,7 @@
           </w:tcPr>
           <w:p>
             <w:r>
-              <w:t xml:space="preserve">M6: </w:t>
-            </w:r>
-            <w:proofErr w:type="spellStart"/>
-            <w:r>
-              <w:t>Release</w:t>
-            </w:r>
-            <w:proofErr w:type="spellEnd"/>
-            <w:r>
-              <w:t xml:space="preserve"> GA</w:t>
+              <w:t xml:space="preserve">M6: Release GA</w:t>
             </w:r>
           </w:p>
         </w:tc>
@@ -2560,8 +1860,6 @@
           <w:p>
             <w:r>
               <w:t xml:space="preserve">Despliegue final en Azure y lanzamiento </w:t>
-            </w:r>
-            <w:r>
               <w:lastRenderedPageBreak/>
               <w:t>comercial.</w:t>
             </w:r>
@@ -2592,21 +1890,7 @@
     </w:tbl>
     <w:p>
       <w:r>
-        <w:t xml:space="preserve">Nota de </w:t>
-      </w:r>
-      <w:r>
-        <w:t>Arquitectura: *</w:t>
-      </w:r>
-      <w:r>
-        <w:t xml:space="preserve"> El Hito M1 se mantiene en verificación pendiente de la implementación operativa del versionado de migraciones (</w:t>
-      </w:r>
-      <w:proofErr w:type="spellStart"/>
-      <w:r>
-        <w:t>Alembic</w:t>
-      </w:r>
-      <w:proofErr w:type="spellEnd"/>
-      <w:r>
-        <w:t>), dado que actualmente los esquemas se inyectan mediante scripts SQL manuales, lo que representa un riesgo para la paridad de entornos superiores.</w:t>
+        <w:t xml:space="preserve">Nota de Arquitectura: * El Hito M1 se mantiene en verificación pendiente de la implementación operativa del versionado de migraciones (Alembic), dado que actualmente los esquemas se inyectan mediante scripts SQL manuales, lo que representa un riesgo para la paridad de entornos superiores.</w:t>
       </w:r>
     </w:p>
     <w:p>
@@ -2666,10 +1950,7 @@
       </w:pPr>
       <w:bookmarkStart w:id="4" w:name="_Toc240108198"/>
       <w:r>
-        <w:t>3</w:t>
-      </w:r>
-      <w:r>
-        <w:t>. AVANCE Y ASIGNACIÓN POR EQUIPOS DE TRABAJO (E1 A E6)</w:t>
+        <w:t>3. AVANCE Y ASIGNACIÓN POR EQUIPOS DE TRABAJO (E1 A E6)</w:t>
       </w:r>
       <w:bookmarkEnd w:id="4"/>
     </w:p>
@@ -2691,16 +1972,8 @@
         <w:rPr>
           <w:b/>
         </w:rPr>
-        <w:t xml:space="preserve">máquina de estados de </w:t>
-      </w:r>
-      <w:proofErr w:type="spellStart"/>
-      <w:r>
-        <w:rPr>
-          <w:b/>
-        </w:rPr>
-        <w:t>jobs</w:t>
-      </w:r>
-      <w:proofErr w:type="spellEnd"/>
+        <w:t xml:space="preserve">máquina de estados de jobs</w:t>
+      </w:r>
       <w:r>
         <w:t xml:space="preserve"> (13 estados de transición). Se reportan avances en el desarrollo del </w:t>
       </w:r>
@@ -2711,47 +1984,23 @@
         <w:t>Grafo de Conocimiento (CodeMapping)</w:t>
       </w:r>
       <w:r>
-        <w:t xml:space="preserve"> para proveer contexto profundo a los agentes. El diseño de </w:t>
-      </w:r>
-      <w:proofErr w:type="spellStart"/>
-      <w:r>
-        <w:t>prompts</w:t>
-      </w:r>
-      <w:proofErr w:type="spellEnd"/>
-      <w:r>
-        <w:t xml:space="preserve"> se ha optimizado para la estructura de </w:t>
+        <w:t xml:space="preserve"> para proveer contexto profundo a los agentes. El diseño de prompts se ha optimizado para la estructura de </w:t>
       </w:r>
       <w:r>
         <w:rPr>
           <w:b/>
         </w:rPr>
-        <w:t xml:space="preserve">3 </w:t>
-      </w:r>
-      <w:proofErr w:type="spellStart"/>
-      <w:r>
-        <w:rPr>
-          <w:b/>
-        </w:rPr>
-        <w:t>tiers</w:t>
-      </w:r>
-      <w:proofErr w:type="spellEnd"/>
-      <w:r>
-        <w:rPr>
-          <w:b/>
-        </w:rPr>
-        <w:t xml:space="preserve"> de LLM</w:t>
+        <w:t xml:space="preserve">3 tiers de LLM</w:t>
       </w:r>
       <w:r>
         <w:t xml:space="preserve"> (</w:t>
       </w:r>
-      <w:proofErr w:type="gramStart"/>
       <w:r>
         <w:rPr>
           <w:i/>
         </w:rPr>
         <w:t>flash</w:t>
       </w:r>
-      <w:proofErr w:type="gramEnd"/>
       <w:r>
         <w:t xml:space="preserve">, </w:t>
       </w:r>
@@ -2771,15 +2020,7 @@
         <w:t>fable</w:t>
       </w:r>
       <w:r>
-        <w:t xml:space="preserve">), permitiendo un escalado dinámico de costos y precisión según la complejidad del </w:t>
-      </w:r>
-      <w:proofErr w:type="gramStart"/>
-      <w:r>
-        <w:t>ticket</w:t>
-      </w:r>
-      <w:proofErr w:type="gramEnd"/>
-      <w:r>
-        <w:t>.</w:t>
+        <w:t xml:space="preserve">), permitiendo un escalado dinámico de costos y precisión según la complejidad del ticket.</w:t>
       </w:r>
     </w:p>
     <w:p>
@@ -2800,35 +2041,7 @@
         <w:rPr>
           <w:b/>
         </w:rPr>
-        <w:t>BDD (</w:t>
-      </w:r>
-      <w:proofErr w:type="spellStart"/>
-      <w:r>
-        <w:rPr>
-          <w:b/>
-        </w:rPr>
-        <w:t>Behavior-Driven</w:t>
-      </w:r>
-      <w:proofErr w:type="spellEnd"/>
-      <w:r>
-        <w:rPr>
-          <w:b/>
-        </w:rPr>
-        <w:t xml:space="preserve"> </w:t>
-      </w:r>
-      <w:proofErr w:type="spellStart"/>
-      <w:r>
-        <w:rPr>
-          <w:b/>
-        </w:rPr>
-        <w:t>Development</w:t>
-      </w:r>
-      <w:proofErr w:type="spellEnd"/>
-      <w:r>
-        <w:rPr>
-          <w:b/>
-        </w:rPr>
-        <w:t>)</w:t>
+        <w:t xml:space="preserve">BDD (Behavior-Driven Development)</w:t>
       </w:r>
       <w:r>
         <w:t xml:space="preserve"> bajo criterios </w:t>
@@ -2837,21 +2050,7 @@
         <w:rPr>
           <w:i/>
         </w:rPr>
-        <w:t>Given-</w:t>
-      </w:r>
-      <w:proofErr w:type="spellStart"/>
-      <w:r>
-        <w:rPr>
-          <w:i/>
-        </w:rPr>
-        <w:t>When</w:t>
-      </w:r>
-      <w:proofErr w:type="spellEnd"/>
-      <w:r>
-        <w:rPr>
-          <w:i/>
-        </w:rPr>
-        <w:t>-Then</w:t>
+        <w:t>Given-When-Then</w:t>
       </w:r>
       <w:r>
         <w:t xml:space="preserve">. Se ha implementado el motor de captura de </w:t>
@@ -2880,30 +2079,14 @@
       <w:r>
         <w:t xml:space="preserve">Finalización del </w:t>
       </w:r>
-      <w:proofErr w:type="spellStart"/>
       <w:r>
         <w:rPr>
           <w:b/>
         </w:rPr>
-        <w:t>stepper</w:t>
-      </w:r>
-      <w:proofErr w:type="spellEnd"/>
-      <w:r>
-        <w:rPr>
-          <w:b/>
-        </w:rPr>
-        <w:t xml:space="preserve"> de pipeline</w:t>
-      </w:r>
-      <w:r>
-        <w:t xml:space="preserve"> en la UI/UX, proporcionando visibilidad en tiempo real del flujo </w:t>
-      </w:r>
-      <w:proofErr w:type="spellStart"/>
-      <w:r>
-        <w:t>agéntico</w:t>
-      </w:r>
-      <w:proofErr w:type="spellEnd"/>
-      <w:r>
-        <w:t xml:space="preserve">. Integración de la vista de </w:t>
+        <w:t xml:space="preserve">stepper de pipeline</w:t>
+      </w:r>
+      <w:r>
+        <w:t xml:space="preserve"> en la UI/UX, proporcionando visibilidad en tiempo real del flujo agéntico. Integración de la vista de </w:t>
       </w:r>
       <w:r>
         <w:rPr>
@@ -2913,8 +2096,6 @@
       </w:r>
       <w:r>
         <w:t xml:space="preserve"> </w:t>
-      </w:r>
-      <w:r>
         <w:lastRenderedPageBreak/>
         <w:t xml:space="preserve">para los tres </w:t>
       </w:r>
@@ -2927,14 +2108,12 @@
       <w:r>
         <w:t xml:space="preserve"> de gobernanza, permitiendo a los aprobadores humanos validar el </w:t>
       </w:r>
-      <w:proofErr w:type="spellStart"/>
       <w:r>
         <w:rPr>
           <w:i/>
         </w:rPr>
         <w:t>compliance</w:t>
       </w:r>
-      <w:proofErr w:type="spellEnd"/>
       <w:r>
         <w:t xml:space="preserve"> normativo antes de cada despliegue.</w:t>
       </w:r>
@@ -2993,39 +2172,21 @@
       <w:r>
         <w:t xml:space="preserve"> Gestión de 5 repositorios bajo el estándar de </w:t>
       </w:r>
-      <w:proofErr w:type="spellStart"/>
       <w:r>
         <w:rPr>
           <w:b/>
         </w:rPr>
-        <w:t>monorepo</w:t>
-      </w:r>
-      <w:proofErr w:type="spellEnd"/>
-      <w:r>
-        <w:rPr>
-          <w:b/>
-        </w:rPr>
-        <w:t xml:space="preserve"> </w:t>
-      </w:r>
-      <w:proofErr w:type="spellStart"/>
-      <w:r>
-        <w:rPr>
-          <w:b/>
-        </w:rPr>
-        <w:t>uv</w:t>
-      </w:r>
-      <w:proofErr w:type="spellEnd"/>
+        <w:t xml:space="preserve">monorepo uv</w:t>
+      </w:r>
       <w:r>
         <w:t xml:space="preserve"> y orquestación de </w:t>
       </w:r>
-      <w:proofErr w:type="spellStart"/>
       <w:r>
         <w:rPr>
           <w:i/>
         </w:rPr>
         <w:t>linters</w:t>
       </w:r>
-      <w:proofErr w:type="spellEnd"/>
       <w:r>
         <w:t xml:space="preserve"> en </w:t>
       </w:r>
@@ -3051,21 +2212,7 @@
         <w:rPr>
           <w:b/>
         </w:rPr>
-        <w:t>Miembro C (</w:t>
-      </w:r>
-      <w:proofErr w:type="spellStart"/>
-      <w:r>
-        <w:rPr>
-          <w:b/>
-        </w:rPr>
-        <w:t>SecOps</w:t>
-      </w:r>
-      <w:proofErr w:type="spellEnd"/>
-      <w:r>
-        <w:rPr>
-          <w:b/>
-        </w:rPr>
-        <w:t>):</w:t>
+        <w:t>Miembro C (SecOps):</w:t>
       </w:r>
       <w:r>
         <w:t xml:space="preserve"> Implementación de </w:t>
@@ -3079,19 +2226,11 @@
       <w:r>
         <w:t xml:space="preserve"> y </w:t>
       </w:r>
-      <w:proofErr w:type="spellStart"/>
       <w:r>
         <w:rPr>
           <w:b/>
         </w:rPr>
-        <w:t>Sandboxes</w:t>
-      </w:r>
-      <w:proofErr w:type="spellEnd"/>
-      <w:r>
-        <w:rPr>
-          <w:b/>
-        </w:rPr>
-        <w:t xml:space="preserve"> efímeros</w:t>
+        <w:t xml:space="preserve">Sandboxes efímeros</w:t>
       </w:r>
       <w:r>
         <w:t xml:space="preserve"> para la ejecución segura de código en la fase de </w:t>
@@ -3124,14 +2263,12 @@
       <w:r>
         <w:t xml:space="preserve">Supervisión del alcance </w:t>
       </w:r>
-      <w:proofErr w:type="spellStart"/>
       <w:r>
         <w:rPr>
           <w:b/>
         </w:rPr>
         <w:t>cross-tenant</w:t>
       </w:r>
-      <w:proofErr w:type="spellEnd"/>
       <w:r>
         <w:t xml:space="preserve"> bajo las </w:t>
       </w:r>
@@ -3175,21 +2312,7 @@
         <w:rPr>
           <w:b/>
         </w:rPr>
-        <w:t>Concesiones justificadas (</w:t>
-      </w:r>
-      <w:proofErr w:type="spellStart"/>
-      <w:r>
-        <w:rPr>
-          <w:b/>
-        </w:rPr>
-        <w:t>Grants</w:t>
-      </w:r>
-      <w:proofErr w:type="spellEnd"/>
-      <w:r>
-        <w:rPr>
-          <w:b/>
-        </w:rPr>
-        <w:t>)</w:t>
+        <w:t>Concesiones justificadas (Grants)</w:t>
       </w:r>
       <w:r>
         <w:t xml:space="preserve"> temporales y documentadas.</w:t>
@@ -3237,10 +2360,7 @@
       </w:pPr>
       <w:bookmarkStart w:id="9" w:name="_Toc240108203"/>
       <w:r>
-        <w:t>4</w:t>
-      </w:r>
-      <w:r>
-        <w:t>. GESTIÓN DE RIESGOS, DEUDA TÉCNICA Y CONFLICTOS RESUELTOS</w:t>
+        <w:t>4. GESTIÓN DE RIESGOS, DEUDA TÉCNICA Y CONFLICTOS RESUELTOS</w:t>
       </w:r>
       <w:bookmarkEnd w:id="9"/>
     </w:p>
@@ -3269,15 +2389,7 @@
         <w:t>Problema:</w:t>
       </w:r>
       <w:r>
-        <w:t xml:space="preserve"> Inconsistencias entre el middleware de RLS y los </w:t>
-      </w:r>
-      <w:proofErr w:type="spellStart"/>
-      <w:r>
-        <w:t>DDLs</w:t>
-      </w:r>
-      <w:proofErr w:type="spellEnd"/>
-      <w:r>
-        <w:t xml:space="preserve"> de aplicación, con riesgo de </w:t>
+        <w:t xml:space="preserve"> Inconsistencias entre el middleware de RLS y los DDLs de aplicación, con riesgo de </w:t>
       </w:r>
       <w:r>
         <w:rPr>
@@ -3310,26 +2422,10 @@
         <w:rPr>
           <w:b/>
         </w:rPr>
-        <w:t>D06 (SQL-</w:t>
-      </w:r>
-      <w:proofErr w:type="spellStart"/>
-      <w:r>
-        <w:rPr>
-          <w:b/>
-        </w:rPr>
-        <w:t>first</w:t>
-      </w:r>
-      <w:proofErr w:type="spellEnd"/>
-      <w:r>
-        <w:rPr>
-          <w:b/>
-        </w:rPr>
-        <w:t>)</w:t>
+        <w:t>D06 (SQL-first)</w:t>
       </w:r>
       <w:r>
         <w:t xml:space="preserve">. Los esquemas se definen centralmente, forzando a la capa de aplicación a operar exclusivamente a través del objeto sesion_tenant. Esta medida neutraliza </w:t>
-      </w:r>
-      <w:r>
         <w:lastRenderedPageBreak/>
         <w:t>la elusión accidental de políticas de seguridad en el motor de base de datos.</w:t>
       </w:r>
@@ -3433,15 +2529,7 @@
         <w:t>BLE001</w:t>
       </w:r>
       <w:r>
-        <w:t xml:space="preserve">) y concatenación de </w:t>
-      </w:r>
-      <w:proofErr w:type="spellStart"/>
-      <w:r>
-        <w:t>strings</w:t>
-      </w:r>
-      <w:proofErr w:type="spellEnd"/>
-      <w:r>
-        <w:t xml:space="preserve"> en plantillas (</w:t>
+        <w:t xml:space="preserve">) y concatenación de strings en plantillas (</w:t>
       </w:r>
       <w:r>
         <w:rPr>
@@ -3465,21 +2553,7 @@
         <w:rPr>
           <w:b/>
         </w:rPr>
-        <w:t>Equipo 6 (Consola/</w:t>
-      </w:r>
-      <w:proofErr w:type="spellStart"/>
-      <w:r>
-        <w:rPr>
-          <w:b/>
-        </w:rPr>
-        <w:t>Admin</w:t>
-      </w:r>
-      <w:proofErr w:type="spellEnd"/>
-      <w:r>
-        <w:rPr>
-          <w:b/>
-        </w:rPr>
-        <w:t>):</w:t>
+        <w:t>Equipo 6 (Consola/Admin):</w:t>
       </w:r>
       <w:r>
         <w:t xml:space="preserve"> Tipado de telemetría (</w:t>
@@ -3491,15 +2565,7 @@
         <w:t>PYI034</w:t>
       </w:r>
       <w:r>
-        <w:t xml:space="preserve">) y revisión de dependencias de </w:t>
-      </w:r>
-      <w:proofErr w:type="spellStart"/>
-      <w:r>
-        <w:t>FastAPI</w:t>
-      </w:r>
-      <w:proofErr w:type="spellEnd"/>
-      <w:r>
-        <w:t xml:space="preserve"> (</w:t>
+        <w:t xml:space="preserve">) y revisión de dependencias de FastAPI (</w:t>
       </w:r>
       <w:r>
         <w:rPr>
@@ -3526,15 +2592,7 @@
         <w:t>Equipo 2 (Fábrica):</w:t>
       </w:r>
       <w:r>
-        <w:t xml:space="preserve"> Eliminación de variables de </w:t>
-      </w:r>
-      <w:proofErr w:type="spellStart"/>
-      <w:r>
-        <w:t>job</w:t>
-      </w:r>
-      <w:proofErr w:type="spellEnd"/>
-      <w:r>
-        <w:t xml:space="preserve"> residuales (</w:t>
+        <w:t xml:space="preserve"> Eliminación de variables de job residuales (</w:t>
       </w:r>
       <w:r>
         <w:rPr>
@@ -3543,15 +2601,7 @@
         <w:t>F841</w:t>
       </w:r>
       <w:r>
-        <w:t xml:space="preserve">) y supresión de excepciones con </w:t>
-      </w:r>
-      <w:proofErr w:type="spellStart"/>
-      <w:r>
-        <w:t>pass</w:t>
-      </w:r>
-      <w:proofErr w:type="spellEnd"/>
-      <w:r>
-        <w:t xml:space="preserve"> (</w:t>
+        <w:t xml:space="preserve">) y supresión de excepciones con pass (</w:t>
       </w:r>
       <w:r>
         <w:rPr>
@@ -3569,10 +2619,7 @@
       </w:pPr>
       <w:bookmarkStart w:id="13" w:name="_Toc240108207"/>
       <w:r>
-        <w:t>5</w:t>
-      </w:r>
-      <w:r>
-        <w:t>. PRÓXIMOS PASOS Y PRÓXIMAS ENTREGAS ESTRATÉGICAS</w:t>
+        <w:t>5. PRÓXIMOS PASOS Y PRÓXIMAS ENTREGAS ESTRATÉGICAS</w:t>
       </w:r>
       <w:bookmarkEnd w:id="13"/>
     </w:p>
@@ -3588,23 +2635,7 @@
     </w:p>
     <w:p>
       <w:r>
-        <w:t xml:space="preserve">Para la próxima revisión con la comisión </w:t>
-      </w:r>
-      <w:proofErr w:type="spellStart"/>
-      <w:r>
-        <w:t>Capstone</w:t>
-      </w:r>
-      <w:proofErr w:type="spellEnd"/>
-      <w:r>
-        <w:t xml:space="preserve"> (Prof. Luis Bravo) y el </w:t>
-      </w:r>
-      <w:proofErr w:type="gramStart"/>
-      <w:r>
-        <w:t>sponsor</w:t>
-      </w:r>
-      <w:proofErr w:type="gramEnd"/>
-      <w:r>
-        <w:t xml:space="preserve"> </w:t>
+        <w:t xml:space="preserve">Para la próxima revisión con la comisión Capstone (Prof. Luis Bravo) y el sponsor </w:t>
       </w:r>
       <w:r>
         <w:rPr>
@@ -3634,15 +2665,7 @@
         <w:t>Triage Agéntico</w:t>
       </w:r>
       <w:r>
-        <w:t xml:space="preserve"> con </w:t>
-      </w:r>
-      <w:proofErr w:type="spellStart"/>
-      <w:r>
-        <w:t>deduplicación</w:t>
-      </w:r>
-      <w:proofErr w:type="spellEnd"/>
-      <w:r>
-        <w:t xml:space="preserve"> activa mediante </w:t>
+        <w:t xml:space="preserve"> con deduplicación activa mediante </w:t>
       </w:r>
       <w:r>
         <w:rPr>
@@ -3728,35 +2751,13 @@
         <w:t>Integración del Orquestador:</w:t>
       </w:r>
       <w:r>
-        <w:t xml:space="preserve"> Conexión del "cerebro </w:t>
-      </w:r>
-      <w:proofErr w:type="spellStart"/>
-      <w:r>
-        <w:t>agéntico</w:t>
-      </w:r>
-      <w:proofErr w:type="spellEnd"/>
-      <w:r>
-        <w:t xml:space="preserve">" con la </w:t>
+        <w:t xml:space="preserve"> Conexión del "cerebro agéntico" con la </w:t>
       </w:r>
       <w:r>
         <w:rPr>
           <w:b/>
         </w:rPr>
-        <w:t>API interna (/</w:t>
-      </w:r>
-      <w:proofErr w:type="spellStart"/>
-      <w:r>
-        <w:rPr>
-          <w:b/>
-        </w:rPr>
-        <w:t>internal</w:t>
-      </w:r>
-      <w:proofErr w:type="spellEnd"/>
-      <w:r>
-        <w:rPr>
-          <w:b/>
-        </w:rPr>
-        <w:t>/v1)</w:t>
+        <w:t>API interna (/internal/v1)</w:t>
       </w:r>
       <w:r>
         <w:t>. Este componente representa el riesgo de camino crítico para el cierre de M2.</w:t>
@@ -3788,14 +2789,12 @@
       <w:r>
         <w:t xml:space="preserve">) y monitoreo de </w:t>
       </w:r>
-      <w:proofErr w:type="spellStart"/>
       <w:r>
         <w:rPr>
           <w:i/>
         </w:rPr>
         <w:t>Throughput</w:t>
       </w:r>
-      <w:proofErr w:type="spellEnd"/>
       <w:r>
         <w:t xml:space="preserve"> del pipeline.</w:t>
       </w:r>

</xml_diff>